<commit_message>
Doc final hito 2
</commit_message>
<xml_diff>
--- a/Hito2/Documentacion/Hito_2_final.docx
+++ b/Hito2/Documentacion/Hito_2_final.docx
@@ -11,7 +11,7 @@
           <w:noProof/>
         </w:rPr>
         <w:drawing>
-          <wp:inline distT="0" distB="0" distL="0" distR="0" wp14:anchorId="649430D3" wp14:editId="362C03DF">
+          <wp:inline distT="0" distB="0" distL="0" distR="0" wp14:anchorId="649430D3" wp14:editId="0FDAED26">
             <wp:extent cx="3667125" cy="1857375"/>
             <wp:effectExtent l="0" t="0" r="9525" b="9525"/>
             <wp:docPr id="704665366" name="Imagen 1" descr="Logotipo, nombre de la empresa&#10;&#10;El contenido generado por IA puede ser incorrecto."/>
@@ -199,6 +199,15 @@
     </w:p>
     <w:sdt>
       <w:sdtPr>
+        <w:rPr>
+          <w:rFonts w:asciiTheme="minorHAnsi" w:eastAsiaTheme="minorHAnsi" w:hAnsiTheme="minorHAnsi" w:cstheme="minorBidi"/>
+          <w:color w:val="auto"/>
+          <w:kern w:val="2"/>
+          <w:sz w:val="24"/>
+          <w:szCs w:val="24"/>
+          <w:lang w:eastAsia="en-US"/>
+          <w14:ligatures w14:val="standardContextual"/>
+        </w:rPr>
         <w:id w:val="1399330649"/>
         <w:docPartObj>
           <w:docPartGallery w:val="Table of Contents"/>
@@ -207,15 +216,8 @@
       </w:sdtPr>
       <w:sdtEndPr>
         <w:rPr>
-          <w:rFonts w:asciiTheme="minorHAnsi" w:eastAsiaTheme="minorHAnsi" w:hAnsiTheme="minorHAnsi" w:cstheme="minorBidi"/>
           <w:b/>
           <w:bCs/>
-          <w:color w:val="auto"/>
-          <w:kern w:val="2"/>
-          <w:sz w:val="24"/>
-          <w:szCs w:val="24"/>
-          <w:lang w:eastAsia="en-US"/>
-          <w14:ligatures w14:val="standardContextual"/>
         </w:rPr>
       </w:sdtEndPr>
       <w:sdtContent>
@@ -249,7 +251,7 @@
           <w:r>
             <w:fldChar w:fldCharType="separate"/>
           </w:r>
-          <w:hyperlink w:anchor="_Toc221374066" w:history="1">
+          <w:hyperlink w:anchor="_Toc221377049" w:history="1">
             <w:r>
               <w:rPr>
                 <w:rStyle w:val="Hipervnculo"/>
@@ -291,7 +293,7 @@
                 <w:noProof/>
                 <w:webHidden/>
               </w:rPr>
-              <w:instrText xml:space="preserve"> PAGEREF _Toc221374066 \h </w:instrText>
+              <w:instrText xml:space="preserve"> PAGEREF _Toc221377049 \h </w:instrText>
             </w:r>
             <w:r>
               <w:rPr>
@@ -334,7 +336,7 @@
               <w:lang w:eastAsia="es-ES"/>
             </w:rPr>
           </w:pPr>
-          <w:hyperlink w:anchor="_Toc221374067" w:history="1">
+          <w:hyperlink w:anchor="_Toc221377050" w:history="1">
             <w:r>
               <w:rPr>
                 <w:rStyle w:val="Hipervnculo"/>
@@ -361,7 +363,7 @@
                 <w:noProof/>
                 <w:webHidden/>
               </w:rPr>
-              <w:instrText xml:space="preserve"> PAGEREF _Toc221374067 \h </w:instrText>
+              <w:instrText xml:space="preserve"> PAGEREF _Toc221377050 \h </w:instrText>
             </w:r>
             <w:r>
               <w:rPr>
@@ -404,7 +406,7 @@
               <w:lang w:eastAsia="es-ES"/>
             </w:rPr>
           </w:pPr>
-          <w:hyperlink w:anchor="_Toc221374068" w:history="1">
+          <w:hyperlink w:anchor="_Toc221377051" w:history="1">
             <w:r>
               <w:rPr>
                 <w:rStyle w:val="Hipervnculo"/>
@@ -431,7 +433,7 @@
                 <w:noProof/>
                 <w:webHidden/>
               </w:rPr>
-              <w:instrText xml:space="preserve"> PAGEREF _Toc221374068 \h </w:instrText>
+              <w:instrText xml:space="preserve"> PAGEREF _Toc221377051 \h </w:instrText>
             </w:r>
             <w:r>
               <w:rPr>
@@ -474,7 +476,7 @@
               <w:lang w:eastAsia="es-ES"/>
             </w:rPr>
           </w:pPr>
-          <w:hyperlink w:anchor="_Toc221374069" w:history="1">
+          <w:hyperlink w:anchor="_Toc221377052" w:history="1">
             <w:r>
               <w:rPr>
                 <w:rStyle w:val="Hipervnculo"/>
@@ -501,7 +503,7 @@
                 <w:noProof/>
                 <w:webHidden/>
               </w:rPr>
-              <w:instrText xml:space="preserve"> PAGEREF _Toc221374069 \h </w:instrText>
+              <w:instrText xml:space="preserve"> PAGEREF _Toc221377052 \h </w:instrText>
             </w:r>
             <w:r>
               <w:rPr>
@@ -545,7 +547,7 @@
               <w:lang w:eastAsia="es-ES"/>
             </w:rPr>
           </w:pPr>
-          <w:hyperlink w:anchor="_Toc221374070" w:history="1">
+          <w:hyperlink w:anchor="_Toc221377053" w:history="1">
             <w:r>
               <w:rPr>
                 <w:rStyle w:val="Hipervnculo"/>
@@ -587,7 +589,7 @@
                 <w:noProof/>
                 <w:webHidden/>
               </w:rPr>
-              <w:instrText xml:space="preserve"> PAGEREF _Toc221374070 \h </w:instrText>
+              <w:instrText xml:space="preserve"> PAGEREF _Toc221377053 \h </w:instrText>
             </w:r>
             <w:r>
               <w:rPr>
@@ -630,7 +632,7 @@
               <w:lang w:eastAsia="es-ES"/>
             </w:rPr>
           </w:pPr>
-          <w:hyperlink w:anchor="_Toc221374071" w:history="1">
+          <w:hyperlink w:anchor="_Toc221377054" w:history="1">
             <w:r>
               <w:rPr>
                 <w:rStyle w:val="Hipervnculo"/>
@@ -657,7 +659,7 @@
                 <w:noProof/>
                 <w:webHidden/>
               </w:rPr>
-              <w:instrText xml:space="preserve"> PAGEREF _Toc221374071 \h </w:instrText>
+              <w:instrText xml:space="preserve"> PAGEREF _Toc221377054 \h </w:instrText>
             </w:r>
             <w:r>
               <w:rPr>
@@ -700,7 +702,7 @@
               <w:lang w:eastAsia="es-ES"/>
             </w:rPr>
           </w:pPr>
-          <w:hyperlink w:anchor="_Toc221374072" w:history="1">
+          <w:hyperlink w:anchor="_Toc221377055" w:history="1">
             <w:r>
               <w:rPr>
                 <w:rStyle w:val="Hipervnculo"/>
@@ -727,7 +729,7 @@
                 <w:noProof/>
                 <w:webHidden/>
               </w:rPr>
-              <w:instrText xml:space="preserve"> PAGEREF _Toc221374072 \h </w:instrText>
+              <w:instrText xml:space="preserve"> PAGEREF _Toc221377055 \h </w:instrText>
             </w:r>
             <w:r>
               <w:rPr>
@@ -771,7 +773,7 @@
               <w:lang w:eastAsia="es-ES"/>
             </w:rPr>
           </w:pPr>
-          <w:hyperlink w:anchor="_Toc221374073" w:history="1">
+          <w:hyperlink w:anchor="_Toc221377056" w:history="1">
             <w:r>
               <w:rPr>
                 <w:rStyle w:val="Hipervnculo"/>
@@ -813,7 +815,7 @@
                 <w:noProof/>
                 <w:webHidden/>
               </w:rPr>
-              <w:instrText xml:space="preserve"> PAGEREF _Toc221374073 \h </w:instrText>
+              <w:instrText xml:space="preserve"> PAGEREF _Toc221377056 \h </w:instrText>
             </w:r>
             <w:r>
               <w:rPr>
@@ -833,7 +835,7 @@
                 <w:noProof/>
                 <w:webHidden/>
               </w:rPr>
-              <w:t>7</w:t>
+              <w:t>6</w:t>
             </w:r>
             <w:r>
               <w:rPr>
@@ -856,7 +858,7 @@
               <w:lang w:eastAsia="es-ES"/>
             </w:rPr>
           </w:pPr>
-          <w:hyperlink w:anchor="_Toc221374074" w:history="1">
+          <w:hyperlink w:anchor="_Toc221377057" w:history="1">
             <w:r>
               <w:rPr>
                 <w:rStyle w:val="Hipervnculo"/>
@@ -883,7 +885,7 @@
                 <w:noProof/>
                 <w:webHidden/>
               </w:rPr>
-              <w:instrText xml:space="preserve"> PAGEREF _Toc221374074 \h </w:instrText>
+              <w:instrText xml:space="preserve"> PAGEREF _Toc221377057 \h </w:instrText>
             </w:r>
             <w:r>
               <w:rPr>
@@ -903,7 +905,7 @@
                 <w:noProof/>
                 <w:webHidden/>
               </w:rPr>
-              <w:t>7</w:t>
+              <w:t>6</w:t>
             </w:r>
             <w:r>
               <w:rPr>
@@ -926,7 +928,7 @@
               <w:lang w:eastAsia="es-ES"/>
             </w:rPr>
           </w:pPr>
-          <w:hyperlink w:anchor="_Toc221374076" w:history="1">
+          <w:hyperlink w:anchor="_Toc221377059" w:history="1">
             <w:r>
               <w:rPr>
                 <w:rStyle w:val="Hipervnculo"/>
@@ -953,7 +955,7 @@
                 <w:noProof/>
                 <w:webHidden/>
               </w:rPr>
-              <w:instrText xml:space="preserve"> PAGEREF _Toc221374076 \h </w:instrText>
+              <w:instrText xml:space="preserve"> PAGEREF _Toc221377059 \h </w:instrText>
             </w:r>
             <w:r>
               <w:rPr>
@@ -997,7 +999,7 @@
               <w:lang w:eastAsia="es-ES"/>
             </w:rPr>
           </w:pPr>
-          <w:hyperlink w:anchor="_Toc221374077" w:history="1">
+          <w:hyperlink w:anchor="_Toc221377060" w:history="1">
             <w:r>
               <w:rPr>
                 <w:rStyle w:val="Hipervnculo"/>
@@ -1039,7 +1041,7 @@
                 <w:noProof/>
                 <w:webHidden/>
               </w:rPr>
-              <w:instrText xml:space="preserve"> PAGEREF _Toc221374077 \h </w:instrText>
+              <w:instrText xml:space="preserve"> PAGEREF _Toc221377060 \h </w:instrText>
             </w:r>
             <w:r>
               <w:rPr>
@@ -1059,7 +1061,7 @@
                 <w:noProof/>
                 <w:webHidden/>
               </w:rPr>
-              <w:t>8</w:t>
+              <w:t>7</w:t>
             </w:r>
             <w:r>
               <w:rPr>
@@ -1082,7 +1084,7 @@
               <w:lang w:eastAsia="es-ES"/>
             </w:rPr>
           </w:pPr>
-          <w:hyperlink w:anchor="_Toc221374078" w:history="1">
+          <w:hyperlink w:anchor="_Toc221377061" w:history="1">
             <w:r>
               <w:rPr>
                 <w:rStyle w:val="Hipervnculo"/>
@@ -1109,7 +1111,7 @@
                 <w:noProof/>
                 <w:webHidden/>
               </w:rPr>
-              <w:instrText xml:space="preserve"> PAGEREF _Toc221374078 \h </w:instrText>
+              <w:instrText xml:space="preserve"> PAGEREF _Toc221377061 \h </w:instrText>
             </w:r>
             <w:r>
               <w:rPr>
@@ -1129,7 +1131,7 @@
                 <w:noProof/>
                 <w:webHidden/>
               </w:rPr>
-              <w:t>8</w:t>
+              <w:t>7</w:t>
             </w:r>
             <w:r>
               <w:rPr>
@@ -1152,7 +1154,7 @@
               <w:lang w:eastAsia="es-ES"/>
             </w:rPr>
           </w:pPr>
-          <w:hyperlink w:anchor="_Toc221374079" w:history="1">
+          <w:hyperlink w:anchor="_Toc221377062" w:history="1">
             <w:r>
               <w:rPr>
                 <w:rStyle w:val="Hipervnculo"/>
@@ -1179,7 +1181,7 @@
                 <w:noProof/>
                 <w:webHidden/>
               </w:rPr>
-              <w:instrText xml:space="preserve"> PAGEREF _Toc221374079 \h </w:instrText>
+              <w:instrText xml:space="preserve"> PAGEREF _Toc221377062 \h </w:instrText>
             </w:r>
             <w:r>
               <w:rPr>
@@ -1222,7 +1224,7 @@
               <w:lang w:eastAsia="es-ES"/>
             </w:rPr>
           </w:pPr>
-          <w:hyperlink w:anchor="_Toc221374080" w:history="1">
+          <w:hyperlink w:anchor="_Toc221377063" w:history="1">
             <w:r>
               <w:rPr>
                 <w:rStyle w:val="Hipervnculo"/>
@@ -1249,7 +1251,7 @@
                 <w:noProof/>
                 <w:webHidden/>
               </w:rPr>
-              <w:instrText xml:space="preserve"> PAGEREF _Toc221374080 \h </w:instrText>
+              <w:instrText xml:space="preserve"> PAGEREF _Toc221377063 \h </w:instrText>
             </w:r>
             <w:r>
               <w:rPr>
@@ -1292,7 +1294,7 @@
               <w:lang w:eastAsia="es-ES"/>
             </w:rPr>
           </w:pPr>
-          <w:hyperlink w:anchor="_Toc221374081" w:history="1">
+          <w:hyperlink w:anchor="_Toc221377064" w:history="1">
             <w:r>
               <w:rPr>
                 <w:rStyle w:val="Hipervnculo"/>
@@ -1319,7 +1321,7 @@
                 <w:noProof/>
                 <w:webHidden/>
               </w:rPr>
-              <w:instrText xml:space="preserve"> PAGEREF _Toc221374081 \h </w:instrText>
+              <w:instrText xml:space="preserve"> PAGEREF _Toc221377064 \h </w:instrText>
             </w:r>
             <w:r>
               <w:rPr>
@@ -1363,7 +1365,7 @@
               <w:lang w:eastAsia="es-ES"/>
             </w:rPr>
           </w:pPr>
-          <w:hyperlink w:anchor="_Toc221374082" w:history="1">
+          <w:hyperlink w:anchor="_Toc221377065" w:history="1">
             <w:r>
               <w:rPr>
                 <w:rStyle w:val="Hipervnculo"/>
@@ -1405,7 +1407,7 @@
                 <w:noProof/>
                 <w:webHidden/>
               </w:rPr>
-              <w:instrText xml:space="preserve"> PAGEREF _Toc221374082 \h </w:instrText>
+              <w:instrText xml:space="preserve"> PAGEREF _Toc221377065 \h </w:instrText>
             </w:r>
             <w:r>
               <w:rPr>
@@ -1449,7 +1451,7 @@
               <w:lang w:eastAsia="es-ES"/>
             </w:rPr>
           </w:pPr>
-          <w:hyperlink w:anchor="_Toc221374083" w:history="1">
+          <w:hyperlink w:anchor="_Toc221377066" w:history="1">
             <w:r>
               <w:rPr>
                 <w:rStyle w:val="Hipervnculo"/>
@@ -1491,7 +1493,7 @@
                 <w:noProof/>
                 <w:webHidden/>
               </w:rPr>
-              <w:instrText xml:space="preserve"> PAGEREF _Toc221374083 \h </w:instrText>
+              <w:instrText xml:space="preserve"> PAGEREF _Toc221377066 \h </w:instrText>
             </w:r>
             <w:r>
               <w:rPr>
@@ -1545,11 +1547,8 @@
           <w:ilvl w:val="0"/>
           <w:numId w:val="1"/>
         </w:numPr>
-        <w:rPr>
-          <w:rFonts w:hint="eastAsia"/>
-        </w:rPr>
-      </w:pPr>
-      <w:bookmarkStart w:id="0" w:name="_Toc221374066"/>
+      </w:pPr>
+      <w:bookmarkStart w:id="0" w:name="_Toc221377049"/>
       <w:r>
         <w:lastRenderedPageBreak/>
         <w:t>Introducción</w:t>
@@ -1559,22 +1558,14 @@
     <w:p>
       <w:pPr>
         <w:pStyle w:val="Titulo2"/>
-        <w:rPr>
-          <w:rFonts w:hint="eastAsia"/>
-        </w:rPr>
-      </w:pPr>
-      <w:bookmarkStart w:id="1" w:name="_Toc221374067"/>
+      </w:pPr>
+      <w:bookmarkStart w:id="1" w:name="_Toc221377050"/>
       <w:r>
         <w:t>Objetivo del proyecto</w:t>
       </w:r>
       <w:bookmarkEnd w:id="1"/>
     </w:p>
     <w:p>
-      <w:pPr>
-        <w:rPr>
-          <w:rFonts w:hint="eastAsia"/>
-        </w:rPr>
-      </w:pPr>
       <w:r>
         <w:tab/>
         <w:t>'</w:t>
@@ -1595,33 +1586,20 @@
     <w:p>
       <w:pPr>
         <w:pStyle w:val="Titulo2"/>
-        <w:rPr>
-          <w:rFonts w:hint="eastAsia"/>
-        </w:rPr>
-      </w:pPr>
-      <w:bookmarkStart w:id="2" w:name="_Toc221374068"/>
+      </w:pPr>
+      <w:bookmarkStart w:id="2" w:name="_Toc221377051"/>
       <w:r>
         <w:t>Justificación del proyecto</w:t>
       </w:r>
       <w:bookmarkEnd w:id="2"/>
     </w:p>
     <w:p>
-      <w:pPr>
-        <w:rPr>
-          <w:rFonts w:hint="eastAsia"/>
-        </w:rPr>
-      </w:pPr>
       <w:r>
         <w:tab/>
         <w:t>El presente proyecto capitaliza en un mercado de nicho muy poco explotado: alquiler de habitaciones estudiantiles.</w:t>
       </w:r>
     </w:p>
     <w:p>
-      <w:pPr>
-        <w:rPr>
-          <w:rFonts w:hint="eastAsia"/>
-        </w:rPr>
-      </w:pPr>
       <w:r>
         <w:tab/>
       </w:r>
@@ -1635,31 +1613,7 @@
       </w:r>
       <w:proofErr w:type="spellEnd"/>
       <w:r>
-        <w:t xml:space="preserve"> toma como premisa la dificultad que presenta para </w:t>
-      </w:r>
-      <w:proofErr w:type="gramStart"/>
-      <w:r>
-        <w:t>un joven recién alcanzada</w:t>
-      </w:r>
-      <w:proofErr w:type="gramEnd"/>
-      <w:r>
-        <w:t xml:space="preserve"> la mayoría de edad encontrar una residencia temporal mientras se cursa el año académico. El resto de </w:t>
-      </w:r>
-      <w:proofErr w:type="gramStart"/>
-      <w:r>
-        <w:t>páginas</w:t>
-      </w:r>
-      <w:proofErr w:type="gramEnd"/>
-      <w:r>
-        <w:t xml:space="preserve"> web ofrecen todo tipo de productos inmobiliarios, desde alquiler y compra de pisos para residencia indefinida hasta de naves industriales y oficinas. Alquiler de estudios y habitaciones también está comprendido pero la oferta, aunque sea elevada, se diluye entre el resto de </w:t>
-      </w:r>
-      <w:proofErr w:type="gramStart"/>
-      <w:r>
-        <w:t>anuncios</w:t>
-      </w:r>
-      <w:proofErr w:type="gramEnd"/>
-      <w:r>
-        <w:t xml:space="preserve">. Como resultado, el cliente puede abrumarse y sentirse frustrado con el proceso, </w:t>
+        <w:t xml:space="preserve"> toma como premisa la dificultad que presenta para un joven recién alcanzada la mayoría de edad encontrar una residencia temporal mientras se cursa el año académico. El resto de páginas web ofrecen todo tipo de productos inmobiliarios, desde alquiler y compra de pisos para residencia indefinida hasta de naves industriales y oficinas. Alquiler de estudios y habitaciones también está comprendido pero la oferta, aunque sea elevada, se diluye entre el resto de anuncios. Como resultado, el cliente puede abrumarse y sentirse frustrado con el proceso, </w:t>
       </w:r>
       <w:proofErr w:type="spellStart"/>
       <w:r>
@@ -1671,22 +1625,12 @@
       </w:r>
     </w:p>
     <w:p>
-      <w:pPr>
-        <w:rPr>
-          <w:rFonts w:hint="eastAsia"/>
-        </w:rPr>
-      </w:pPr>
       <w:r>
         <w:tab/>
         <w:t>Identificada la problemática, el equipo ha desarrollado una aplicación enfocada sólo en los estudiantes, enfatizando los tres requisitos más importantes que este tipo de cliente busca: cercanía al centro de estudios, precio asequible y sencillez de uso.</w:t>
       </w:r>
     </w:p>
     <w:p>
-      <w:pPr>
-        <w:rPr>
-          <w:rFonts w:hint="eastAsia"/>
-        </w:rPr>
-      </w:pPr>
       <w:r>
         <w:tab/>
         <w:t>En relación con los arrendadores, se les está ofreciendo clientes altamente especializados en su producto, si cumple con las condiciones. Todo usuario del sitio web busca un único producto, por lo que garantiza que cada visita a las habitaciones anunciadas sea un cliente altamente potencial.</w:t>
@@ -1695,33 +1639,20 @@
     <w:p>
       <w:pPr>
         <w:pStyle w:val="Titulo2"/>
-        <w:rPr>
-          <w:rFonts w:hint="eastAsia"/>
-        </w:rPr>
-      </w:pPr>
-      <w:bookmarkStart w:id="3" w:name="_Toc221374069"/>
+      </w:pPr>
+      <w:bookmarkStart w:id="3" w:name="_Toc221377052"/>
       <w:r>
         <w:t>Análisis de lo existente</w:t>
       </w:r>
       <w:bookmarkEnd w:id="3"/>
     </w:p>
     <w:p>
-      <w:pPr>
-        <w:rPr>
-          <w:rFonts w:hint="eastAsia"/>
-        </w:rPr>
-      </w:pPr>
       <w:r>
         <w:tab/>
         <w:t>La propuesta está fuertemente influenciada por Idealista y Fotocasa, los dos grandes portales de compra y alquiler de viviendas en España. Aunque ambas empresas también contemplan el alquiler de habitaciones, su foco está en el alquiler y venta para domicilio a largo plazo. Para los jóvenes adultos resultan plataformas incómodas de navegar.</w:t>
       </w:r>
     </w:p>
     <w:p>
-      <w:pPr>
-        <w:rPr>
-          <w:rFonts w:hint="eastAsia"/>
-        </w:rPr>
-      </w:pPr>
       <w:r>
         <w:tab/>
         <w:t>Una plataforma más similar en premisa es Piso Compartido. Se centran en alquiler de habitaciones en viviendas compartidas o pisos completos de un tamaño reducido de uso individual.</w:t>
@@ -1781,7 +1712,7 @@
           <w:szCs w:val="44"/>
         </w:rPr>
       </w:pPr>
-      <w:bookmarkStart w:id="4" w:name="_Toc221374070"/>
+      <w:bookmarkStart w:id="4" w:name="_Toc221377053"/>
       <w:r>
         <w:rPr>
           <w:sz w:val="44"/>
@@ -1810,7 +1741,7 @@
       </w:r>
     </w:p>
     <w:p>
-      <w:bookmarkStart w:id="5" w:name="_Toc221374071"/>
+      <w:bookmarkStart w:id="5" w:name="_Toc221377054"/>
       <w:r>
         <w:rPr>
           <w:rStyle w:val="Titulo2Car"/>
@@ -2032,7 +1963,7 @@
       <w:pPr>
         <w:pStyle w:val="Titulo2"/>
       </w:pPr>
-      <w:bookmarkStart w:id="6" w:name="_Toc221374072"/>
+      <w:bookmarkStart w:id="6" w:name="_Toc221377055"/>
       <w:r>
         <w:t>Arrendador</w:t>
       </w:r>
@@ -2303,9 +2234,8 @@
           <w:numId w:val="1"/>
         </w:numPr>
       </w:pPr>
-      <w:bookmarkStart w:id="7" w:name="_Toc221374073"/>
-      <w:r>
-        <w:lastRenderedPageBreak/>
+      <w:bookmarkStart w:id="7" w:name="_Toc221377056"/>
+      <w:r>
         <w:t>Análisis y Diseño</w:t>
       </w:r>
       <w:bookmarkEnd w:id="7"/>
@@ -2314,7 +2244,7 @@
       <w:pPr>
         <w:pStyle w:val="Titulo2"/>
       </w:pPr>
-      <w:bookmarkStart w:id="8" w:name="_Toc221374074"/>
+      <w:bookmarkStart w:id="8" w:name="_Toc221377057"/>
       <w:r>
         <w:t>Diagrama de casos de uso</w:t>
       </w:r>
@@ -2326,6 +2256,7 @@
       </w:pPr>
       <w:bookmarkStart w:id="9" w:name="_Toc221373254"/>
       <w:bookmarkStart w:id="10" w:name="_Toc221374075"/>
+      <w:bookmarkStart w:id="11" w:name="_Toc221377058"/>
       <w:r>
         <w:rPr>
           <w:noProof/>
@@ -2374,316 +2305,8 @@
       </w:r>
       <w:bookmarkEnd w:id="9"/>
       <w:bookmarkEnd w:id="10"/>
-    </w:p>
-    <w:p>
-      <w:pPr>
-        <w:pStyle w:val="Titulo2"/>
-      </w:pPr>
-      <w:bookmarkStart w:id="11" w:name="_Toc221374076"/>
-      <w:r>
-        <w:t>Diagrama de clases</w:t>
-      </w:r>
       <w:bookmarkEnd w:id="11"/>
     </w:p>
-    <w:p>
-      <w:pPr>
-        <w:pStyle w:val="Titulo2"/>
-        <w:rPr>
-          <w:rFonts w:hint="eastAsia"/>
-        </w:rPr>
-      </w:pPr>
-    </w:p>
-    <w:p/>
-    <w:p/>
-    <w:p/>
-    <w:p/>
-    <w:p/>
-    <w:p/>
-    <w:p/>
-    <w:p/>
-    <w:p/>
-    <w:p>
-      <w:pPr>
-        <w:pStyle w:val="Titulo1"/>
-        <w:numPr>
-          <w:ilvl w:val="0"/>
-          <w:numId w:val="1"/>
-        </w:numPr>
-      </w:pPr>
-      <w:bookmarkStart w:id="12" w:name="_Toc221374077"/>
-      <w:r>
-        <w:lastRenderedPageBreak/>
-        <w:t>Metodología de desarrollo</w:t>
-      </w:r>
-      <w:bookmarkEnd w:id="12"/>
-    </w:p>
-    <w:p>
-      <w:pPr>
-        <w:pStyle w:val="Titulo2"/>
-      </w:pPr>
-      <w:bookmarkStart w:id="13" w:name="_Toc221374078"/>
-      <w:r>
-        <w:t>Ciclo de vida</w:t>
-      </w:r>
-      <w:bookmarkEnd w:id="13"/>
-      <w:r>
-        <w:t xml:space="preserve"> </w:t>
-      </w:r>
-    </w:p>
-    <w:p>
-      <w:pPr>
-        <w:rPr>
-          <w:rFonts w:hint="eastAsia"/>
-        </w:rPr>
-      </w:pPr>
-      <w:r>
-        <w:t>Todo proyecto requiere ceñirse a una metodología bien organizada. Sin una, el desarrollo puede desviarse del camino esperado y no alcanzar las metas esperadas o en un trabajo del todo improductivo.</w:t>
-      </w:r>
-    </w:p>
-    <w:p>
-      <w:pPr>
-        <w:rPr>
-          <w:rFonts w:hint="eastAsia"/>
-        </w:rPr>
-      </w:pPr>
-      <w:r>
-        <w:tab/>
-        <w:t>La propia organización del proyecto, en especial a los relativos al software, tiene igual o incluso mayor importancia que el desarrollo del producto.</w:t>
-      </w:r>
-    </w:p>
-    <w:p>
-      <w:pPr>
-        <w:rPr>
-          <w:rFonts w:hint="eastAsia"/>
-        </w:rPr>
-      </w:pPr>
-      <w:r>
-        <w:tab/>
-        <w:t>Por dicho motivo,</w:t>
-      </w:r>
-    </w:p>
-    <w:p>
-      <w:pPr>
-        <w:rPr>
-          <w:rFonts w:hint="eastAsia"/>
-        </w:rPr>
-      </w:pPr>
-      <w:r>
-        <w:t>_____________________________________________________________________________</w:t>
-      </w:r>
-    </w:p>
-    <w:p>
-      <w:pPr>
-        <w:rPr>
-          <w:rFonts w:hint="eastAsia"/>
-        </w:rPr>
-      </w:pPr>
-      <w:r>
-        <w:tab/>
-        <w:t xml:space="preserve">Todo proyecto se rige por un modelo de ciclo de vida. Se tratan de esquemas que organizan las diferentes fases del desarrollo, facilitando la gestión </w:t>
-      </w:r>
-      <w:proofErr w:type="gramStart"/>
-      <w:r>
-        <w:t>del mismo</w:t>
-      </w:r>
-      <w:proofErr w:type="gramEnd"/>
-      <w:r>
-        <w:t>.</w:t>
-      </w:r>
-    </w:p>
-    <w:p>
-      <w:r>
-        <w:tab/>
-      </w:r>
-      <w:proofErr w:type="spellStart"/>
-      <w:r>
-        <w:t>Roomie</w:t>
-      </w:r>
-      <w:proofErr w:type="spellEnd"/>
-      <w:r>
-        <w:t xml:space="preserve"> pretende ofrecer un servicio mantenido y con actualizaciones</w:t>
-      </w:r>
-      <w:r>
-        <w:t xml:space="preserve"> </w:t>
-      </w:r>
-      <w:r>
-        <w:t xml:space="preserve">constantes a largo plazo. Bajo este marco, un modelo de ciclo de vida </w:t>
-      </w:r>
-      <w:r>
-        <w:rPr>
-          <w:b/>
-          <w:bCs/>
-        </w:rPr>
-        <w:t>iterativo</w:t>
-      </w:r>
-      <w:r>
-        <w:t xml:space="preserve"> es el idóneo a implementar. A diferencia </w:t>
-      </w:r>
-      <w:proofErr w:type="gramStart"/>
-      <w:r>
-        <w:t>del cascada</w:t>
-      </w:r>
-      <w:proofErr w:type="gramEnd"/>
-      <w:r>
-        <w:t xml:space="preserve"> y en 'v', ofrece la posibilidad de mantener el proyecto y de alterar aspectos del diseño en versiones posteriores. El modelo en espiral también se ciñe a dicha </w:t>
-      </w:r>
-      <w:r>
-        <w:t>definición,</w:t>
-      </w:r>
-      <w:r>
-        <w:t xml:space="preserve"> pero dada la necesidad de realizar entregas divididas en hitos, no ofrecería ninguna ventaja puesto que no se alterarían anteriores fases en paralelo. Solo pasaría tras una entrega.</w:t>
-      </w:r>
-    </w:p>
-    <w:p/>
-    <w:p>
-      <w:pPr>
-        <w:pStyle w:val="Titulo2"/>
-      </w:pPr>
-      <w:bookmarkStart w:id="14" w:name="_Toc221374079"/>
-      <w:r>
-        <w:t>Metodología ágil</w:t>
-      </w:r>
-      <w:bookmarkEnd w:id="14"/>
-    </w:p>
-    <w:p>
-      <w:r>
-        <w:t>Pensamos que debemos usar una metodología ágil para este proyecto por las siguientes razones:</w:t>
-      </w:r>
-    </w:p>
-    <w:p>
-      <w:pPr>
-        <w:numPr>
-          <w:ilvl w:val="0"/>
-          <w:numId w:val="4"/>
-        </w:numPr>
-      </w:pPr>
-      <w:r>
-        <w:t>Es un proyecto pequeño</w:t>
-      </w:r>
-    </w:p>
-    <w:p>
-      <w:pPr>
-        <w:numPr>
-          <w:ilvl w:val="0"/>
-          <w:numId w:val="4"/>
-        </w:numPr>
-      </w:pPr>
-      <w:r>
-        <w:t>Trabajamos en equipo</w:t>
-      </w:r>
-    </w:p>
-    <w:p>
-      <w:pPr>
-        <w:numPr>
-          <w:ilvl w:val="0"/>
-          <w:numId w:val="4"/>
-        </w:numPr>
-      </w:pPr>
-      <w:r>
-        <w:t>Trabajamos en iteraciones</w:t>
-      </w:r>
-    </w:p>
-    <w:p>
-      <w:pPr>
-        <w:numPr>
-          <w:ilvl w:val="0"/>
-          <w:numId w:val="4"/>
-        </w:numPr>
-      </w:pPr>
-      <w:r>
-        <w:t xml:space="preserve">Tenemos entregables en cada iteración. </w:t>
-      </w:r>
-    </w:p>
-    <w:p/>
-    <w:p>
-      <w:r>
-        <w:t xml:space="preserve">Para este proyecto la metodología Scrum no es adecuada ya que, por una parte, no es un proyecto que invite a hacer reuniones diarias para informar de nuestros avances y problemas. Por otra parte, en la mayor parte del proyecto los integrantes </w:t>
-      </w:r>
-      <w:r>
-        <w:lastRenderedPageBreak/>
-        <w:t>del grupo no vamos a tener un rol prescrito, sino que seremos desarrolladores de mismo nivel.</w:t>
-      </w:r>
-    </w:p>
-    <w:p/>
-    <w:p>
-      <w:r>
-        <w:t xml:space="preserve">Por lo que, para este proyecto nos hemos decantado por la metodología </w:t>
-      </w:r>
-      <w:r>
-        <w:rPr>
-          <w:b/>
-          <w:bCs/>
-        </w:rPr>
-        <w:t>Kanban</w:t>
-      </w:r>
-      <w:r>
-        <w:t>. Nos parece que es una forma sencilla de marcar nuestros objetivos a conseguir en los diferentes Hitos en los que está dividido este proyecto y de repartir el trabajo.</w:t>
-      </w:r>
-    </w:p>
-    <w:p>
-      <w:r>
-        <w:t xml:space="preserve"> </w:t>
-      </w:r>
-      <w:r>
-        <w:br/>
-        <w:t xml:space="preserve">Para llevar a cabo la metodología Kanban, estamos usando la aplicación Trello de la siguiente manera: </w:t>
-      </w:r>
-    </w:p>
-    <w:p>
-      <w:pPr>
-        <w:numPr>
-          <w:ilvl w:val="0"/>
-          <w:numId w:val="5"/>
-        </w:numPr>
-      </w:pPr>
-      <w:r>
-        <w:t>Creamos un tablero para cada iteración (Hitos).</w:t>
-      </w:r>
-    </w:p>
-    <w:p>
-      <w:pPr>
-        <w:numPr>
-          <w:ilvl w:val="0"/>
-          <w:numId w:val="5"/>
-        </w:numPr>
-      </w:pPr>
-      <w:r>
-        <w:t>Separamos en diferentes puntos las tareas que hay que hacer.</w:t>
-      </w:r>
-    </w:p>
-    <w:p>
-      <w:pPr>
-        <w:numPr>
-          <w:ilvl w:val="0"/>
-          <w:numId w:val="5"/>
-        </w:numPr>
-      </w:pPr>
-      <w:r>
-        <w:t>Creamos columnas para saber en qué punto se encuentra cada tarea individual (Por hacer, en revisión, propuestas de cambio y hecho).</w:t>
-      </w:r>
-    </w:p>
-    <w:p>
-      <w:pPr>
-        <w:numPr>
-          <w:ilvl w:val="0"/>
-          <w:numId w:val="5"/>
-        </w:numPr>
-      </w:pPr>
-      <w:r>
-        <w:t xml:space="preserve">Creamos columnas con nuestros nombres para poder elegir o asignar las diferentes tareas. </w:t>
-      </w:r>
-    </w:p>
-    <w:p/>
-    <w:p>
-      <w:r>
-        <w:t xml:space="preserve">De esta forma en cualquier momento podemos saber las tareas que hay por hacer, las que están haciendo los diferentes integrantes del grupo y en qué punto se encuentran. </w:t>
-      </w:r>
-      <w:r>
-        <w:br/>
-        <w:t>Es una forma sencilla y muy visual de organizar un grupo de trabajo de forma remota.</w:t>
-      </w:r>
-    </w:p>
-    <w:p/>
     <w:p>
       <w:pPr>
         <w:rPr>
@@ -2702,7 +2325,310 @@
       <w:pPr>
         <w:pStyle w:val="Titulo2"/>
       </w:pPr>
-      <w:bookmarkStart w:id="15" w:name="_Toc221374080"/>
+      <w:bookmarkStart w:id="12" w:name="_Toc221377059"/>
+      <w:r>
+        <w:lastRenderedPageBreak/>
+        <w:t>Diagrama de clases</w:t>
+      </w:r>
+      <w:bookmarkEnd w:id="12"/>
+    </w:p>
+    <w:p>
+      <w:r>
+        <w:rPr>
+          <w:noProof/>
+        </w:rPr>
+        <w:drawing>
+          <wp:inline distT="0" distB="0" distL="0" distR="0" wp14:anchorId="71AE4456" wp14:editId="58F9AE21">
+            <wp:extent cx="5400040" cy="2819400"/>
+            <wp:effectExtent l="0" t="0" r="0" b="0"/>
+            <wp:docPr id="1583170139" name="Imagen 3" descr="Diagrama&#10;&#10;El contenido generado por IA puede ser incorrecto."/>
+            <wp:cNvGraphicFramePr>
+              <a:graphicFrameLocks xmlns:a="http://schemas.openxmlformats.org/drawingml/2006/main" noChangeAspect="1"/>
+            </wp:cNvGraphicFramePr>
+            <a:graphic xmlns:a="http://schemas.openxmlformats.org/drawingml/2006/main">
+              <a:graphicData uri="http://schemas.openxmlformats.org/drawingml/2006/picture">
+                <pic:pic xmlns:pic="http://schemas.openxmlformats.org/drawingml/2006/picture">
+                  <pic:nvPicPr>
+                    <pic:cNvPr id="1583170139" name="Imagen 3" descr="Diagrama&#10;&#10;El contenido generado por IA puede ser incorrecto."/>
+                    <pic:cNvPicPr/>
+                  </pic:nvPicPr>
+                  <pic:blipFill rotWithShape="1">
+                    <a:blip r:embed="rId10">
+                      <a:extLst>
+                        <a:ext uri="{28A0092B-C50C-407E-A947-70E740481C1C}">
+                          <a14:useLocalDpi xmlns:a14="http://schemas.microsoft.com/office/drawing/2010/main" val="0"/>
+                        </a:ext>
+                      </a:extLst>
+                    </a:blip>
+                    <a:srcRect t="23006" b="5312"/>
+                    <a:stretch>
+                      <a:fillRect/>
+                    </a:stretch>
+                  </pic:blipFill>
+                  <pic:spPr bwMode="auto">
+                    <a:xfrm>
+                      <a:off x="0" y="0"/>
+                      <a:ext cx="5400040" cy="2819400"/>
+                    </a:xfrm>
+                    <a:prstGeom prst="rect">
+                      <a:avLst/>
+                    </a:prstGeom>
+                    <a:ln>
+                      <a:noFill/>
+                    </a:ln>
+                    <a:extLst>
+                      <a:ext uri="{53640926-AAD7-44D8-BBD7-CCE9431645EC}">
+                        <a14:shadowObscured xmlns:a14="http://schemas.microsoft.com/office/drawing/2010/main"/>
+                      </a:ext>
+                    </a:extLst>
+                  </pic:spPr>
+                </pic:pic>
+              </a:graphicData>
+            </a:graphic>
+          </wp:inline>
+        </w:drawing>
+      </w:r>
+    </w:p>
+    <w:p>
+      <w:pPr>
+        <w:pStyle w:val="Titulo1"/>
+        <w:numPr>
+          <w:ilvl w:val="0"/>
+          <w:numId w:val="1"/>
+        </w:numPr>
+      </w:pPr>
+      <w:bookmarkStart w:id="13" w:name="_Toc221377060"/>
+      <w:r>
+        <w:t>Metodología de desarrollo</w:t>
+      </w:r>
+      <w:bookmarkEnd w:id="13"/>
+    </w:p>
+    <w:p>
+      <w:pPr>
+        <w:pStyle w:val="Titulo2"/>
+      </w:pPr>
+      <w:bookmarkStart w:id="14" w:name="_Toc221377061"/>
+      <w:r>
+        <w:t>Ciclo de vida</w:t>
+      </w:r>
+      <w:bookmarkEnd w:id="14"/>
+      <w:r>
+        <w:t xml:space="preserve"> </w:t>
+      </w:r>
+    </w:p>
+    <w:p>
+      <w:r>
+        <w:t>Todo proyecto requiere ceñirse a una metodología bien organizada. Sin una, el desarrollo puede desviarse del camino esperado y no alcanzar las metas esperadas o en un trabajo del todo improductivo.</w:t>
+      </w:r>
+    </w:p>
+    <w:p>
+      <w:r>
+        <w:tab/>
+        <w:t>La propia organización del proyecto, en especial a los relativos al software, tiene igual o incluso mayor importancia que el desarrollo del producto.</w:t>
+      </w:r>
+    </w:p>
+    <w:p>
+      <w:r>
+        <w:tab/>
+        <w:t>Por dicho motivo,</w:t>
+      </w:r>
+    </w:p>
+    <w:p>
+      <w:r>
+        <w:t>_____________________________________________________________________________</w:t>
+      </w:r>
+    </w:p>
+    <w:p>
+      <w:r>
+        <w:tab/>
+        <w:t>Todo proyecto se rige por un modelo de ciclo de vida. Se tratan de esquemas que organizan las diferentes fases del desarrollo, facilitando la gestión del mismo.</w:t>
+      </w:r>
+    </w:p>
+    <w:p>
+      <w:r>
+        <w:tab/>
+      </w:r>
+      <w:proofErr w:type="spellStart"/>
+      <w:r>
+        <w:t>Roomie</w:t>
+      </w:r>
+      <w:proofErr w:type="spellEnd"/>
+      <w:r>
+        <w:t xml:space="preserve"> pretende ofrecer un servicio mantenido y con actualizaciones constantes a largo plazo. Bajo este marco, un modelo de ciclo de vida </w:t>
+      </w:r>
+      <w:r>
+        <w:rPr>
+          <w:b/>
+          <w:bCs/>
+        </w:rPr>
+        <w:t>iterativo</w:t>
+      </w:r>
+      <w:r>
+        <w:t xml:space="preserve"> es el idóneo a implementar. A diferencia del cascada y en 'v', ofrece la posibilidad de mantener el proyecto y de alterar aspectos del diseño en versiones posteriores. El modelo en espiral también se ciñe a dicha definición, pero dada la necesidad de realizar entregas divididas en hitos, no ofrecería ninguna ventaja puesto que no se alterarían anteriores fases en paralelo. Solo pasaría tras una entrega.</w:t>
+      </w:r>
+    </w:p>
+    <w:p/>
+    <w:p>
+      <w:pPr>
+        <w:pStyle w:val="Titulo2"/>
+      </w:pPr>
+      <w:bookmarkStart w:id="15" w:name="_Toc221377062"/>
+      <w:r>
+        <w:lastRenderedPageBreak/>
+        <w:t>Metodología ágil</w:t>
+      </w:r>
+      <w:bookmarkEnd w:id="15"/>
+    </w:p>
+    <w:p>
+      <w:r>
+        <w:t>Pensamos que debemos usar una metodología ágil para este proyecto por las siguientes razones:</w:t>
+      </w:r>
+    </w:p>
+    <w:p>
+      <w:pPr>
+        <w:numPr>
+          <w:ilvl w:val="0"/>
+          <w:numId w:val="4"/>
+        </w:numPr>
+      </w:pPr>
+      <w:r>
+        <w:t>Es un proyecto pequeño</w:t>
+      </w:r>
+    </w:p>
+    <w:p>
+      <w:pPr>
+        <w:numPr>
+          <w:ilvl w:val="0"/>
+          <w:numId w:val="4"/>
+        </w:numPr>
+      </w:pPr>
+      <w:r>
+        <w:t>Trabajamos en equipo</w:t>
+      </w:r>
+    </w:p>
+    <w:p>
+      <w:pPr>
+        <w:numPr>
+          <w:ilvl w:val="0"/>
+          <w:numId w:val="4"/>
+        </w:numPr>
+      </w:pPr>
+      <w:r>
+        <w:t>Trabajamos en iteraciones</w:t>
+      </w:r>
+    </w:p>
+    <w:p>
+      <w:pPr>
+        <w:numPr>
+          <w:ilvl w:val="0"/>
+          <w:numId w:val="4"/>
+        </w:numPr>
+      </w:pPr>
+      <w:r>
+        <w:t xml:space="preserve">Tenemos entregables en cada iteración. </w:t>
+      </w:r>
+    </w:p>
+    <w:p/>
+    <w:p>
+      <w:r>
+        <w:t>Para este proyecto la metodología Scrum no es adecuada ya que, por una parte, no es un proyecto que invite a hacer reuniones diarias para informar de nuestros avances y problemas. Por otra parte, en la mayor parte del proyecto los integrantes del grupo no vamos a tener un rol prescrito, sino que seremos desarrolladores de mismo nivel.</w:t>
+      </w:r>
+    </w:p>
+    <w:p/>
+    <w:p>
+      <w:r>
+        <w:t xml:space="preserve">Por lo que, para este proyecto nos hemos decantado por la metodología </w:t>
+      </w:r>
+      <w:r>
+        <w:rPr>
+          <w:b/>
+          <w:bCs/>
+        </w:rPr>
+        <w:t>Kanban</w:t>
+      </w:r>
+      <w:r>
+        <w:t>. Nos parece que es una forma sencilla de marcar nuestros objetivos a conseguir en los diferentes Hitos en los que está dividido este proyecto y de repartir el trabajo.</w:t>
+      </w:r>
+    </w:p>
+    <w:p>
+      <w:r>
+        <w:t xml:space="preserve"> </w:t>
+      </w:r>
+      <w:r>
+        <w:br/>
+        <w:t xml:space="preserve">Para llevar a cabo la metodología Kanban, estamos usando la aplicación Trello de la siguiente manera: </w:t>
+      </w:r>
+    </w:p>
+    <w:p>
+      <w:pPr>
+        <w:numPr>
+          <w:ilvl w:val="0"/>
+          <w:numId w:val="5"/>
+        </w:numPr>
+      </w:pPr>
+      <w:r>
+        <w:t>Creamos un tablero para cada iteración (Hitos).</w:t>
+      </w:r>
+    </w:p>
+    <w:p>
+      <w:pPr>
+        <w:numPr>
+          <w:ilvl w:val="0"/>
+          <w:numId w:val="5"/>
+        </w:numPr>
+      </w:pPr>
+      <w:r>
+        <w:t>Separamos en diferentes puntos las tareas que hay que hacer.</w:t>
+      </w:r>
+    </w:p>
+    <w:p>
+      <w:pPr>
+        <w:numPr>
+          <w:ilvl w:val="0"/>
+          <w:numId w:val="5"/>
+        </w:numPr>
+      </w:pPr>
+      <w:r>
+        <w:t>Creamos columnas para saber en qué punto se encuentra cada tarea individual (Por hacer, en revisión, propuestas de cambio y hecho).</w:t>
+      </w:r>
+    </w:p>
+    <w:p>
+      <w:pPr>
+        <w:numPr>
+          <w:ilvl w:val="0"/>
+          <w:numId w:val="5"/>
+        </w:numPr>
+      </w:pPr>
+      <w:r>
+        <w:t xml:space="preserve">Creamos columnas con nuestros nombres para poder elegir o asignar las diferentes tareas. </w:t>
+      </w:r>
+    </w:p>
+    <w:p/>
+    <w:p>
+      <w:r>
+        <w:t xml:space="preserve">De esta forma en cualquier momento podemos saber las tareas que hay por hacer, las que están haciendo los diferentes integrantes del grupo y en qué punto se encuentran. </w:t>
+      </w:r>
+      <w:r>
+        <w:br/>
+        <w:t>Es una forma sencilla y muy visual de organizar un grupo de trabajo de forma remota.</w:t>
+      </w:r>
+    </w:p>
+    <w:p>
+      <w:pPr>
+        <w:rPr>
+          <w:rFonts w:asciiTheme="majorHAnsi" w:eastAsiaTheme="majorEastAsia" w:hAnsiTheme="majorHAnsi" w:cstheme="majorBidi"/>
+          <w:color w:val="000000" w:themeColor="text1"/>
+          <w:sz w:val="32"/>
+          <w:szCs w:val="36"/>
+          <w:u w:val="single"/>
+        </w:rPr>
+      </w:pPr>
+    </w:p>
+    <w:p>
+      <w:pPr>
+        <w:pStyle w:val="Titulo2"/>
+      </w:pPr>
+      <w:bookmarkStart w:id="16" w:name="_Toc221377063"/>
       <w:r>
         <w:lastRenderedPageBreak/>
         <w:t xml:space="preserve">Nuestro Tablero </w:t>
@@ -2715,7 +2641,7 @@
       <w:r>
         <w:t xml:space="preserve"> (Hito 2)</w:t>
       </w:r>
-      <w:bookmarkEnd w:id="15"/>
+      <w:bookmarkEnd w:id="16"/>
     </w:p>
     <w:p>
       <w:r>
@@ -2741,7 +2667,7 @@
                     <pic:cNvPicPr/>
                   </pic:nvPicPr>
                   <pic:blipFill>
-                    <a:blip r:embed="rId10"/>
+                    <a:blip r:embed="rId11"/>
                     <a:srcRect l="1996" r="4485" b="49549"/>
                     <a:stretch>
                       <a:fillRect/>
@@ -2783,7 +2709,7 @@
                     <pic:cNvPicPr/>
                   </pic:nvPicPr>
                   <pic:blipFill>
-                    <a:blip r:embed="rId11"/>
+                    <a:blip r:embed="rId12"/>
                     <a:srcRect/>
                     <a:stretch>
                       <a:fillRect/>
@@ -2815,27 +2741,19 @@
       <w:pPr>
         <w:pStyle w:val="Titulo2"/>
       </w:pPr>
-      <w:bookmarkStart w:id="16" w:name="_Toc221374081"/>
+      <w:bookmarkStart w:id="17" w:name="_Toc221377064"/>
       <w:r>
         <w:lastRenderedPageBreak/>
         <w:t>Planificación de tareas y roles de equipo</w:t>
       </w:r>
-      <w:bookmarkEnd w:id="16"/>
+      <w:bookmarkEnd w:id="17"/>
       <w:r>
         <w:t xml:space="preserve"> </w:t>
       </w:r>
     </w:p>
     <w:p>
       <w:r>
-        <w:t xml:space="preserve">En las primeras iteraciones del proyecto la mayoría de </w:t>
-      </w:r>
-      <w:proofErr w:type="gramStart"/>
-      <w:r>
-        <w:t>roles</w:t>
-      </w:r>
-      <w:proofErr w:type="gramEnd"/>
-      <w:r>
-        <w:t xml:space="preserve"> y tareas son compartidas, ya que todos estamos participando conjuntamente en todo tipo de tareas y no necesitamos aún a nadie que haga el rol de jefe de proyecto. </w:t>
+        <w:t xml:space="preserve">En las primeras iteraciones del proyecto la mayoría de roles y tareas son compartidas, ya que todos estamos participando conjuntamente en todo tipo de tareas y no necesitamos aún a nadie que haga el rol de jefe de proyecto. </w:t>
       </w:r>
       <w:r>
         <w:br/>
@@ -4174,12 +4092,12 @@
           <w:numId w:val="1"/>
         </w:numPr>
       </w:pPr>
-      <w:bookmarkStart w:id="17" w:name="_Toc221374082"/>
+      <w:bookmarkStart w:id="18" w:name="_Toc221377065"/>
       <w:r>
         <w:lastRenderedPageBreak/>
         <w:t>Plan de negocio</w:t>
       </w:r>
-      <w:bookmarkEnd w:id="17"/>
+      <w:bookmarkEnd w:id="18"/>
     </w:p>
     <w:p>
       <w:pPr>
@@ -4194,14 +4112,14 @@
           <w:numId w:val="1"/>
         </w:numPr>
       </w:pPr>
-      <w:bookmarkStart w:id="18" w:name="_Toc221374083"/>
+      <w:bookmarkStart w:id="19" w:name="_Toc221377066"/>
       <w:r>
         <w:t>Prevención de Riesgos Laborales</w:t>
       </w:r>
-      <w:bookmarkEnd w:id="18"/>
+      <w:bookmarkEnd w:id="19"/>
     </w:p>
     <w:sectPr>
-      <w:footerReference w:type="default" r:id="rId12"/>
+      <w:footerReference w:type="default" r:id="rId13"/>
       <w:pgSz w:w="11906" w:h="16838"/>
       <w:pgMar w:top="1417" w:right="1701" w:bottom="1417" w:left="1701" w:header="708" w:footer="708" w:gutter="0"/>
       <w:pgNumType w:start="0"/>
@@ -4913,27 +4831,9 @@
   </w:num>
   <w:num w:numId="4" w16cid:durableId="893155815">
     <w:abstractNumId w:val="4"/>
-    <w:lvlOverride w:ilvl="0"/>
-    <w:lvlOverride w:ilvl="1"/>
-    <w:lvlOverride w:ilvl="2"/>
-    <w:lvlOverride w:ilvl="3"/>
-    <w:lvlOverride w:ilvl="4"/>
-    <w:lvlOverride w:ilvl="5"/>
-    <w:lvlOverride w:ilvl="6"/>
-    <w:lvlOverride w:ilvl="7"/>
-    <w:lvlOverride w:ilvl="8"/>
   </w:num>
   <w:num w:numId="5" w16cid:durableId="1892418760">
     <w:abstractNumId w:val="2"/>
-    <w:lvlOverride w:ilvl="0"/>
-    <w:lvlOverride w:ilvl="1"/>
-    <w:lvlOverride w:ilvl="2"/>
-    <w:lvlOverride w:ilvl="3"/>
-    <w:lvlOverride w:ilvl="4"/>
-    <w:lvlOverride w:ilvl="5"/>
-    <w:lvlOverride w:ilvl="6"/>
-    <w:lvlOverride w:ilvl="7"/>
-    <w:lvlOverride w:ilvl="8"/>
   </w:num>
 </w:numbering>
 </file>
@@ -5540,6 +5440,7 @@
   <w:style w:type="character" w:default="1" w:styleId="Fuentedeprrafopredeter">
     <w:name w:val="Default Paragraph Font"/>
     <w:uiPriority w:val="1"/>
+    <w:semiHidden/>
     <w:unhideWhenUsed/>
   </w:style>
   <w:style w:type="table" w:default="1" w:styleId="Tablanormal">

</xml_diff>